<commit_message>
comolete TP1 Spark: Programmation des RDDs avec Spark
</commit_message>
<xml_diff>
--- a/AppacheSparkSQL/SPARK-SQL.docx
+++ b/AppacheSparkSQL/SPARK-SQL.docx
@@ -5,7 +5,9 @@
     <w:sdt>
       <w:sdtPr>
         <w:rPr>
+          <w:rFonts w:eastAsiaTheme="minorHAnsi"/>
           <w:color w:val="4472C4" w:themeColor="accent1"/>
+          <w:lang w:val="fr-FR"/>
         </w:rPr>
         <w:id w:val="-1252963334"/>
         <w:docPartObj>
@@ -15,9 +17,7 @@
       </w:sdtPr>
       <w:sdtEndPr>
         <w:rPr>
-          <w:rFonts w:eastAsiaTheme="minorHAnsi"/>
           <w:color w:val="auto"/>
-          <w:lang w:val="fr-FR"/>
         </w:rPr>
       </w:sdtEndPr>
       <w:sdtContent>
@@ -107,6 +107,7 @@
             <w:dataBinding w:prefixMappings="xmlns:ns0='http://purl.org/dc/elements/1.1/' xmlns:ns1='http://schemas.openxmlformats.org/package/2006/metadata/core-properties' " w:xpath="/ns1:coreProperties[1]/ns0:title[1]" w:storeItemID="{6C3C8BC8-F283-45AE-878A-BAB7291924A1}"/>
             <w:text/>
           </w:sdtPr>
+          <w:sdtEndPr/>
           <w:sdtContent>
             <w:p>
               <w:pPr>
@@ -154,6 +155,7 @@
             <w:dataBinding w:prefixMappings="xmlns:ns0='http://purl.org/dc/elements/1.1/' xmlns:ns1='http://schemas.openxmlformats.org/package/2006/metadata/core-properties' " w:xpath="/ns1:coreProperties[1]/ns0:subject[1]" w:storeItemID="{6C3C8BC8-F283-45AE-878A-BAB7291924A1}"/>
             <w:text/>
           </w:sdtPr>
+          <w:sdtEndPr/>
           <w:sdtContent>
             <w:p>
               <w:pPr>
@@ -268,6 +270,7 @@
                                     <w:calendar w:val="gregorian"/>
                                   </w:date>
                                 </w:sdtPr>
+                                <w:sdtEndPr/>
                                 <w:sdtContent>
                                   <w:p>
                                     <w:pPr>
@@ -314,6 +317,11 @@
                                     <w:dataBinding w:prefixMappings="xmlns:ns0='http://schemas.openxmlformats.org/officeDocument/2006/extended-properties' " w:xpath="/ns0:Properties[1]/ns0:Company[1]" w:storeItemID="{6668398D-A668-4E3E-A5EB-62B293D839F1}"/>
                                     <w:text/>
                                   </w:sdtPr>
+                                  <w:sdtEndPr>
+                                    <w:rPr>
+                                      <w:rStyle w:val="IntenseEmphasis"/>
+                                    </w:rPr>
+                                  </w:sdtEndPr>
                                   <w:sdtContent>
                                     <w:r>
                                       <w:rPr>
@@ -345,6 +353,7 @@
                                     <w:dataBinding w:prefixMappings="xmlns:ns0='http://schemas.microsoft.com/office/2006/coverPageProps' " w:xpath="/ns0:CoverPageProperties[1]/ns0:CompanyAddress[1]" w:storeItemID="{55AF091B-3C7A-41E3-B477-F2FDAA23CFDA}"/>
                                     <w:text/>
                                   </w:sdtPr>
+                                  <w:sdtEndPr/>
                                   <w:sdtContent>
                                     <w:r>
                                       <w:rPr>
@@ -403,6 +412,7 @@
                               <w:calendar w:val="gregorian"/>
                             </w:date>
                           </w:sdtPr>
+                          <w:sdtEndPr/>
                           <w:sdtContent>
                             <w:p>
                               <w:pPr>
@@ -449,6 +459,11 @@
                               <w:dataBinding w:prefixMappings="xmlns:ns0='http://schemas.openxmlformats.org/officeDocument/2006/extended-properties' " w:xpath="/ns0:Properties[1]/ns0:Company[1]" w:storeItemID="{6668398D-A668-4E3E-A5EB-62B293D839F1}"/>
                               <w:text/>
                             </w:sdtPr>
+                            <w:sdtEndPr>
+                              <w:rPr>
+                                <w:rStyle w:val="IntenseEmphasis"/>
+                              </w:rPr>
+                            </w:sdtEndPr>
                             <w:sdtContent>
                               <w:r>
                                 <w:rPr>
@@ -480,6 +495,7 @@
                               <w:dataBinding w:prefixMappings="xmlns:ns0='http://schemas.microsoft.com/office/2006/coverPageProps' " w:xpath="/ns0:CoverPageProperties[1]/ns0:CompanyAddress[1]" w:storeItemID="{55AF091B-3C7A-41E3-B477-F2FDAA23CFDA}"/>
                               <w:text/>
                             </w:sdtPr>
+                            <w:sdtEndPr/>
                             <w:sdtContent>
                               <w:r>
                                 <w:rPr>
@@ -590,10 +606,10 @@
     <w:p>
       <w:r>
         <w:drawing>
-          <wp:inline distT="0" distB="0" distL="0" distR="0" wp14:anchorId="32E52EEA" wp14:editId="7CBB8F7C">
-            <wp:extent cx="5943600" cy="3374390"/>
+          <wp:inline distT="0" distB="0" distL="0" distR="0" wp14:anchorId="451F0B62" wp14:editId="0A5982D8">
+            <wp:extent cx="5943600" cy="3321685"/>
             <wp:effectExtent l="0" t="0" r="0" b="0"/>
-            <wp:docPr id="2" name="Picture 2"/>
+            <wp:docPr id="3" name="Picture 3"/>
             <wp:cNvGraphicFramePr>
               <a:graphicFrameLocks xmlns:a="http://schemas.openxmlformats.org/drawingml/2006/main" noChangeAspect="1"/>
             </wp:cNvGraphicFramePr>
@@ -613,7 +629,7 @@
                   <pic:spPr>
                     <a:xfrm>
                       <a:off x="0" y="0"/>
-                      <a:ext cx="5943600" cy="3374390"/>
+                      <a:ext cx="5943600" cy="3321685"/>
                     </a:xfrm>
                     <a:prstGeom prst="rect">
                       <a:avLst/>
@@ -628,6 +644,9 @@
     </w:p>
     <w:p>
       <w:r>
+        <w:rPr>
+          <w:noProof/>
+        </w:rPr>
         <w:drawing>
           <wp:inline distT="0" distB="0" distL="0" distR="0" wp14:anchorId="5E0D26B5" wp14:editId="6C1F6A95">
             <wp:extent cx="5943600" cy="1054100"/>
@@ -673,8 +692,407 @@
       <w:r>
         <w:t>2. Display the schema.</w:t>
       </w:r>
+      <w:r>
+        <w:t xml:space="preserve"> </w:t>
+      </w:r>
+    </w:p>
+    <w:p>
+      <w:r>
+        <w:rPr>
+          <w:noProof/>
+        </w:rPr>
+        <w:drawing>
+          <wp:inline distT="0" distB="0" distL="0" distR="0" wp14:anchorId="59B7209E" wp14:editId="27D3DFB4">
+            <wp:extent cx="5943600" cy="1440180"/>
+            <wp:effectExtent l="0" t="0" r="0" b="7620"/>
+            <wp:docPr id="4" name="Picture 4"/>
+            <wp:cNvGraphicFramePr>
+              <a:graphicFrameLocks xmlns:a="http://schemas.openxmlformats.org/drawingml/2006/main" noChangeAspect="1"/>
+            </wp:cNvGraphicFramePr>
+            <a:graphic xmlns:a="http://schemas.openxmlformats.org/drawingml/2006/main">
+              <a:graphicData uri="http://schemas.openxmlformats.org/drawingml/2006/picture">
+                <pic:pic xmlns:pic="http://schemas.openxmlformats.org/drawingml/2006/picture">
+                  <pic:nvPicPr>
+                    <pic:cNvPr id="1" name=""/>
+                    <pic:cNvPicPr/>
+                  </pic:nvPicPr>
+                  <pic:blipFill>
+                    <a:blip r:embed="rId9"/>
+                    <a:stretch>
+                      <a:fillRect/>
+                    </a:stretch>
+                  </pic:blipFill>
+                  <pic:spPr>
+                    <a:xfrm>
+                      <a:off x="0" y="0"/>
+                      <a:ext cx="5943600" cy="1440180"/>
+                    </a:xfrm>
+                    <a:prstGeom prst="rect">
+                      <a:avLst/>
+                    </a:prstGeom>
+                  </pic:spPr>
+                </pic:pic>
+              </a:graphicData>
+            </a:graphic>
+          </wp:inline>
+        </w:drawing>
+      </w:r>
+    </w:p>
+    <w:p>
+      <w:pPr>
+        <w:pStyle w:val="Heading3"/>
+        <w:ind w:left="720" w:firstLine="720"/>
+      </w:pPr>
+      <w:r>
+        <w:lastRenderedPageBreak/>
+        <w:t xml:space="preserve">3. </w:t>
+      </w:r>
+      <w:r>
+        <w:t>Show the first 5 rows.</w:t>
+      </w:r>
+    </w:p>
+    <w:p>
+      <w:r>
+        <w:drawing>
+          <wp:inline distT="0" distB="0" distL="0" distR="0" wp14:anchorId="31DC86BD" wp14:editId="7429C06C">
+            <wp:extent cx="4846740" cy="1143099"/>
+            <wp:effectExtent l="0" t="0" r="0" b="0"/>
+            <wp:docPr id="5" name="Picture 5"/>
+            <wp:cNvGraphicFramePr>
+              <a:graphicFrameLocks xmlns:a="http://schemas.openxmlformats.org/drawingml/2006/main" noChangeAspect="1"/>
+            </wp:cNvGraphicFramePr>
+            <a:graphic xmlns:a="http://schemas.openxmlformats.org/drawingml/2006/main">
+              <a:graphicData uri="http://schemas.openxmlformats.org/drawingml/2006/picture">
+                <pic:pic xmlns:pic="http://schemas.openxmlformats.org/drawingml/2006/picture">
+                  <pic:nvPicPr>
+                    <pic:cNvPr id="1" name=""/>
+                    <pic:cNvPicPr/>
+                  </pic:nvPicPr>
+                  <pic:blipFill>
+                    <a:blip r:embed="rId10"/>
+                    <a:stretch>
+                      <a:fillRect/>
+                    </a:stretch>
+                  </pic:blipFill>
+                  <pic:spPr>
+                    <a:xfrm>
+                      <a:off x="0" y="0"/>
+                      <a:ext cx="4846740" cy="1143099"/>
+                    </a:xfrm>
+                    <a:prstGeom prst="rect">
+                      <a:avLst/>
+                    </a:prstGeom>
+                  </pic:spPr>
+                </pic:pic>
+              </a:graphicData>
+            </a:graphic>
+          </wp:inline>
+        </w:drawing>
+      </w:r>
     </w:p>
     <w:p/>
+    <w:p>
+      <w:pPr>
+        <w:pStyle w:val="Heading3"/>
+      </w:pPr>
+      <w:r>
+        <w:tab/>
+      </w:r>
+      <w:r>
+        <w:tab/>
+        <w:t xml:space="preserve">4. </w:t>
+      </w:r>
+      <w:r>
+        <w:t>How many rentals are in the dataset?</w:t>
+      </w:r>
+    </w:p>
+    <w:p>
+      <w:r>
+        <w:drawing>
+          <wp:inline distT="0" distB="0" distL="0" distR="0" wp14:anchorId="3E0D862B" wp14:editId="27E0E322">
+            <wp:extent cx="5159187" cy="1272650"/>
+            <wp:effectExtent l="0" t="0" r="3810" b="3810"/>
+            <wp:docPr id="6" name="Picture 6"/>
+            <wp:cNvGraphicFramePr>
+              <a:graphicFrameLocks xmlns:a="http://schemas.openxmlformats.org/drawingml/2006/main" noChangeAspect="1"/>
+            </wp:cNvGraphicFramePr>
+            <a:graphic xmlns:a="http://schemas.openxmlformats.org/drawingml/2006/main">
+              <a:graphicData uri="http://schemas.openxmlformats.org/drawingml/2006/picture">
+                <pic:pic xmlns:pic="http://schemas.openxmlformats.org/drawingml/2006/picture">
+                  <pic:nvPicPr>
+                    <pic:cNvPr id="1" name=""/>
+                    <pic:cNvPicPr/>
+                  </pic:nvPicPr>
+                  <pic:blipFill>
+                    <a:blip r:embed="rId11"/>
+                    <a:stretch>
+                      <a:fillRect/>
+                    </a:stretch>
+                  </pic:blipFill>
+                  <pic:spPr>
+                    <a:xfrm>
+                      <a:off x="0" y="0"/>
+                      <a:ext cx="5159187" cy="1272650"/>
+                    </a:xfrm>
+                    <a:prstGeom prst="rect">
+                      <a:avLst/>
+                    </a:prstGeom>
+                  </pic:spPr>
+                </pic:pic>
+              </a:graphicData>
+            </a:graphic>
+          </wp:inline>
+        </w:drawing>
+      </w:r>
+    </w:p>
+    <w:p/>
+    <w:p>
+      <w:pPr>
+        <w:pStyle w:val="Heading2"/>
+        <w:ind w:firstLine="720"/>
+      </w:pPr>
+      <w:r>
+        <w:t>2. Create a Temporary View</w:t>
+      </w:r>
+    </w:p>
+    <w:p>
+      <w:r>
+        <w:drawing>
+          <wp:inline distT="0" distB="0" distL="0" distR="0" wp14:anchorId="7DADD4E1" wp14:editId="6790AC88">
+            <wp:extent cx="4709568" cy="967824"/>
+            <wp:effectExtent l="0" t="0" r="0" b="3810"/>
+            <wp:docPr id="7" name="Picture 7"/>
+            <wp:cNvGraphicFramePr>
+              <a:graphicFrameLocks xmlns:a="http://schemas.openxmlformats.org/drawingml/2006/main" noChangeAspect="1"/>
+            </wp:cNvGraphicFramePr>
+            <a:graphic xmlns:a="http://schemas.openxmlformats.org/drawingml/2006/main">
+              <a:graphicData uri="http://schemas.openxmlformats.org/drawingml/2006/picture">
+                <pic:pic xmlns:pic="http://schemas.openxmlformats.org/drawingml/2006/picture">
+                  <pic:nvPicPr>
+                    <pic:cNvPr id="1" name=""/>
+                    <pic:cNvPicPr/>
+                  </pic:nvPicPr>
+                  <pic:blipFill>
+                    <a:blip r:embed="rId12"/>
+                    <a:stretch>
+                      <a:fillRect/>
+                    </a:stretch>
+                  </pic:blipFill>
+                  <pic:spPr>
+                    <a:xfrm>
+                      <a:off x="0" y="0"/>
+                      <a:ext cx="4709568" cy="967824"/>
+                    </a:xfrm>
+                    <a:prstGeom prst="rect">
+                      <a:avLst/>
+                    </a:prstGeom>
+                  </pic:spPr>
+                </pic:pic>
+              </a:graphicData>
+            </a:graphic>
+          </wp:inline>
+        </w:drawing>
+      </w:r>
+    </w:p>
+    <w:p>
+      <w:pPr>
+        <w:pStyle w:val="Heading2"/>
+        <w:ind w:firstLine="720"/>
+      </w:pPr>
+      <w:r>
+        <w:lastRenderedPageBreak/>
+        <w:t>3. Basic SQL Queries</w:t>
+      </w:r>
+    </w:p>
+    <w:p>
+      <w:r>
+        <w:rPr>
+          <w:noProof/>
+        </w:rPr>
+        <w:drawing>
+          <wp:inline distT="0" distB="0" distL="0" distR="0" wp14:anchorId="5DB01E9F" wp14:editId="14A4877F">
+            <wp:extent cx="5943600" cy="4490720"/>
+            <wp:effectExtent l="0" t="0" r="0" b="5080"/>
+            <wp:docPr id="8" name="Picture 8"/>
+            <wp:cNvGraphicFramePr>
+              <a:graphicFrameLocks xmlns:a="http://schemas.openxmlformats.org/drawingml/2006/main" noChangeAspect="1"/>
+            </wp:cNvGraphicFramePr>
+            <a:graphic xmlns:a="http://schemas.openxmlformats.org/drawingml/2006/main">
+              <a:graphicData uri="http://schemas.openxmlformats.org/drawingml/2006/picture">
+                <pic:pic xmlns:pic="http://schemas.openxmlformats.org/drawingml/2006/picture">
+                  <pic:nvPicPr>
+                    <pic:cNvPr id="1" name=""/>
+                    <pic:cNvPicPr/>
+                  </pic:nvPicPr>
+                  <pic:blipFill>
+                    <a:blip r:embed="rId13"/>
+                    <a:stretch>
+                      <a:fillRect/>
+                    </a:stretch>
+                  </pic:blipFill>
+                  <pic:spPr>
+                    <a:xfrm>
+                      <a:off x="0" y="0"/>
+                      <a:ext cx="5943600" cy="4490720"/>
+                    </a:xfrm>
+                    <a:prstGeom prst="rect">
+                      <a:avLst/>
+                    </a:prstGeom>
+                  </pic:spPr>
+                </pic:pic>
+              </a:graphicData>
+            </a:graphic>
+          </wp:inline>
+        </w:drawing>
+      </w:r>
+    </w:p>
+    <w:p>
+      <w:pPr>
+        <w:pStyle w:val="Heading2"/>
+        <w:ind w:firstLine="720"/>
+      </w:pPr>
+      <w:r>
+        <w:lastRenderedPageBreak/>
+        <w:t>4. Aggregation Queries</w:t>
+      </w:r>
+    </w:p>
+    <w:p>
+      <w:r>
+        <w:drawing>
+          <wp:inline distT="0" distB="0" distL="0" distR="0" wp14:anchorId="1CEB2875" wp14:editId="2E0C4B31">
+            <wp:extent cx="5943600" cy="6278245"/>
+            <wp:effectExtent l="0" t="0" r="0" b="8255"/>
+            <wp:docPr id="9" name="Picture 9"/>
+            <wp:cNvGraphicFramePr>
+              <a:graphicFrameLocks xmlns:a="http://schemas.openxmlformats.org/drawingml/2006/main" noChangeAspect="1"/>
+            </wp:cNvGraphicFramePr>
+            <a:graphic xmlns:a="http://schemas.openxmlformats.org/drawingml/2006/main">
+              <a:graphicData uri="http://schemas.openxmlformats.org/drawingml/2006/picture">
+                <pic:pic xmlns:pic="http://schemas.openxmlformats.org/drawingml/2006/picture">
+                  <pic:nvPicPr>
+                    <pic:cNvPr id="1" name=""/>
+                    <pic:cNvPicPr/>
+                  </pic:nvPicPr>
+                  <pic:blipFill>
+                    <a:blip r:embed="rId14"/>
+                    <a:stretch>
+                      <a:fillRect/>
+                    </a:stretch>
+                  </pic:blipFill>
+                  <pic:spPr>
+                    <a:xfrm>
+                      <a:off x="0" y="0"/>
+                      <a:ext cx="5943600" cy="6278245"/>
+                    </a:xfrm>
+                    <a:prstGeom prst="rect">
+                      <a:avLst/>
+                    </a:prstGeom>
+                  </pic:spPr>
+                </pic:pic>
+              </a:graphicData>
+            </a:graphic>
+          </wp:inline>
+        </w:drawing>
+      </w:r>
+    </w:p>
+    <w:p>
+      <w:pPr>
+        <w:pStyle w:val="Heading2"/>
+        <w:ind w:firstLine="720"/>
+      </w:pPr>
+      <w:r>
+        <w:lastRenderedPageBreak/>
+        <w:t>5. Time-Based Analysis</w:t>
+      </w:r>
+    </w:p>
+    <w:p>
+      <w:r>
+        <w:drawing>
+          <wp:inline distT="0" distB="0" distL="0" distR="0" wp14:anchorId="07768EDE" wp14:editId="6A5396F7">
+            <wp:extent cx="5791702" cy="6873836"/>
+            <wp:effectExtent l="0" t="0" r="0" b="3810"/>
+            <wp:docPr id="10" name="Picture 10"/>
+            <wp:cNvGraphicFramePr>
+              <a:graphicFrameLocks xmlns:a="http://schemas.openxmlformats.org/drawingml/2006/main" noChangeAspect="1"/>
+            </wp:cNvGraphicFramePr>
+            <a:graphic xmlns:a="http://schemas.openxmlformats.org/drawingml/2006/main">
+              <a:graphicData uri="http://schemas.openxmlformats.org/drawingml/2006/picture">
+                <pic:pic xmlns:pic="http://schemas.openxmlformats.org/drawingml/2006/picture">
+                  <pic:nvPicPr>
+                    <pic:cNvPr id="1" name=""/>
+                    <pic:cNvPicPr/>
+                  </pic:nvPicPr>
+                  <pic:blipFill>
+                    <a:blip r:embed="rId15"/>
+                    <a:stretch>
+                      <a:fillRect/>
+                    </a:stretch>
+                  </pic:blipFill>
+                  <pic:spPr>
+                    <a:xfrm>
+                      <a:off x="0" y="0"/>
+                      <a:ext cx="5791702" cy="6873836"/>
+                    </a:xfrm>
+                    <a:prstGeom prst="rect">
+                      <a:avLst/>
+                    </a:prstGeom>
+                  </pic:spPr>
+                </pic:pic>
+              </a:graphicData>
+            </a:graphic>
+          </wp:inline>
+        </w:drawing>
+      </w:r>
+    </w:p>
+    <w:p>
+      <w:pPr>
+        <w:pStyle w:val="Heading2"/>
+        <w:ind w:firstLine="720"/>
+      </w:pPr>
+      <w:r>
+        <w:lastRenderedPageBreak/>
+        <w:t>6. User Behavior Analysis</w:t>
+      </w:r>
+    </w:p>
+    <w:p>
+      <w:r>
+        <w:drawing>
+          <wp:inline distT="0" distB="0" distL="0" distR="0" wp14:anchorId="38379792" wp14:editId="101D9E75">
+            <wp:extent cx="5943600" cy="7658735"/>
+            <wp:effectExtent l="0" t="0" r="0" b="0"/>
+            <wp:docPr id="11" name="Picture 11"/>
+            <wp:cNvGraphicFramePr>
+              <a:graphicFrameLocks xmlns:a="http://schemas.openxmlformats.org/drawingml/2006/main" noChangeAspect="1"/>
+            </wp:cNvGraphicFramePr>
+            <a:graphic xmlns:a="http://schemas.openxmlformats.org/drawingml/2006/main">
+              <a:graphicData uri="http://schemas.openxmlformats.org/drawingml/2006/picture">
+                <pic:pic xmlns:pic="http://schemas.openxmlformats.org/drawingml/2006/picture">
+                  <pic:nvPicPr>
+                    <pic:cNvPr id="1" name=""/>
+                    <pic:cNvPicPr/>
+                  </pic:nvPicPr>
+                  <pic:blipFill>
+                    <a:blip r:embed="rId16"/>
+                    <a:stretch>
+                      <a:fillRect/>
+                    </a:stretch>
+                  </pic:blipFill>
+                  <pic:spPr>
+                    <a:xfrm>
+                      <a:off x="0" y="0"/>
+                      <a:ext cx="5943600" cy="7658735"/>
+                    </a:xfrm>
+                    <a:prstGeom prst="rect">
+                      <a:avLst/>
+                    </a:prstGeom>
+                  </pic:spPr>
+                </pic:pic>
+              </a:graphicData>
+            </a:graphic>
+          </wp:inline>
+        </w:drawing>
+      </w:r>
+    </w:p>
     <w:sectPr>
       <w:pgSz w:w="12240" w:h="15840"/>
       <w:pgMar w:top="1440" w:right="1440" w:bottom="1440" w:left="1440" w:header="720" w:footer="720" w:gutter="0"/>
@@ -1339,21 +1757,21 @@
     <w:charset w:val="00"/>
     <w:family w:val="swiss"/>
     <w:pitch w:val="variable"/>
-    <w:sig w:usb0="E0002AFF" w:usb1="4000ACFF" w:usb2="00000001" w:usb3="00000000" w:csb0="000001FF" w:csb1="00000000"/>
+    <w:sig w:usb0="E4002EFF" w:usb1="C200247B" w:usb2="00000009" w:usb3="00000000" w:csb0="000001FF" w:csb1="00000000"/>
   </w:font>
   <w:font w:name="Times New Roman">
     <w:panose1 w:val="02020603050405020304"/>
     <w:charset w:val="00"/>
     <w:family w:val="roman"/>
     <w:pitch w:val="variable"/>
-    <w:sig w:usb0="E0002AFF" w:usb1="C0007843" w:usb2="00000009" w:usb3="00000000" w:csb0="000001FF" w:csb1="00000000"/>
+    <w:sig w:usb0="E0002EFF" w:usb1="C000785B" w:usb2="00000009" w:usb3="00000000" w:csb0="000001FF" w:csb1="00000000"/>
   </w:font>
   <w:font w:name="Calibri Light">
     <w:panose1 w:val="020F0302020204030204"/>
     <w:charset w:val="00"/>
     <w:family w:val="swiss"/>
     <w:pitch w:val="variable"/>
-    <w:sig w:usb0="A0002AEF" w:usb1="4000207B" w:usb2="00000000" w:usb3="00000000" w:csb0="000001FF" w:csb1="00000000"/>
+    <w:sig w:usb0="E4002EFF" w:usb1="C200247B" w:usb2="00000009" w:usb3="00000000" w:csb0="000001FF" w:csb1="00000000"/>
   </w:font>
 </w:fonts>
 </file>
@@ -1374,8 +1792,10 @@
   </w:compat>
   <w:rsids>
     <w:rsidRoot w:val="00E669D4"/>
+    <w:rsid w:val="007D6AED"/>
     <w:rsid w:val="009958C5"/>
     <w:rsid w:val="00E669D4"/>
+    <w:rsid w:val="00FD45EE"/>
   </w:rsids>
   <m:mathPr>
     <m:mathFont m:val="Cambria Math"/>

</xml_diff>